<commit_message>
Match added course docx styling
</commit_message>
<xml_diff>
--- a/public/3 summarized books/Protecting the Next Generation/lesson-information/general/chapter1/Chapter 1.docx
+++ b/public/3 summarized books/Protecting the Next Generation/lesson-information/general/chapter1/Chapter 1.docx
@@ -4,10 +4,18 @@
   <w:body>
     <w:p>
       <w:pPr>
-        <w:pStyle w:val="Title"/>
+        <w:pStyle w:val="Heading1"/>
       </w:pPr>
       <w:r>
-        <w:t xml:space="preserve">Course: Protecting the Next Generation</w:t>
+        <w:t xml:space="preserve">COURSE: Protecting the Next Generation</w:t>
+      </w:r>
+    </w:p>
+    <w:p>
+      <w:pPr>
+        <w:pStyle w:val="Heading2"/>
+      </w:pPr>
+      <w:r>
+        <w:t xml:space="preserve">CHAPTER 1: Understanding the Risk</w:t>
       </w:r>
     </w:p>
     <w:p>
@@ -15,53 +23,63 @@
         <w:pStyle w:val="Heading1"/>
       </w:pPr>
       <w:r>
-        <w:t xml:space="preserve">Chapter 1: Understanding the Risk</w:t>
+        <w:t xml:space="preserve">CHAPTER OVERVIEW</w:t>
       </w:r>
     </w:p>
     <w:p>
       <w:pPr>
-        <w:pStyle w:val="Heading2"/>
+        <w:pStyle w:val="BodyText"/>
       </w:pPr>
-      <w:r>
-        <w:t xml:space="preserve">Chapter Overview</w:t>
-      </w:r>
-    </w:p>
-    <w:p>
       <w:r>
         <w:t xml:space="preserve">Why prevention matters, why the teenage years are vulnerable, and how drug abuse harms body, mind, and future.</w:t>
       </w:r>
     </w:p>
     <w:p>
       <w:pPr>
-        <w:pStyle w:val="Heading2"/>
+        <w:pStyle w:val="Heading1"/>
       </w:pPr>
       <w:r>
-        <w:t xml:space="preserve">Chapter Lessons</w:t>
+        <w:t xml:space="preserve">CHAPTER LESSONS</w:t>
       </w:r>
     </w:p>
     <w:p>
+      <w:pPr>
+        <w:pStyle w:val="BodyText"/>
+      </w:pPr>
       <w:r>
-        <w:t xml:space="preserve">Lesson 1: Why Prevention Matters</w:t>
+        <w:t xml:space="preserve">LESSON 1: Why Prevention Matters</w:t>
       </w:r>
     </w:p>
     <w:p>
+      <w:pPr>
+        <w:pStyle w:val="BodyText"/>
+      </w:pPr>
       <w:r>
-        <w:t xml:space="preserve">Lesson 2: The Teenage Years and Growing Responsibility</w:t>
+        <w:t xml:space="preserve">LESSON 2: The Teenage Years and Growing Responsibility</w:t>
       </w:r>
     </w:p>
     <w:p>
+      <w:pPr>
+        <w:pStyle w:val="BodyText"/>
+      </w:pPr>
       <w:r>
-        <w:t xml:space="preserve">Lesson 3: Physical Dangers of Drug Abuse</w:t>
+        <w:t xml:space="preserve">LESSON 3: Physical Dangers of Drug Abuse</w:t>
       </w:r>
     </w:p>
     <w:p>
+      <w:pPr>
+        <w:pStyle w:val="BodyText"/>
+      </w:pPr>
       <w:r>
-        <w:t xml:space="preserve">Lesson 4: Mental and Emotional Effects of Abuse</w:t>
+        <w:t xml:space="preserve">LESSON 4: Mental and Emotional Effects of Abuse</w:t>
       </w:r>
     </w:p>
     <w:p>
+      <w:pPr>
+        <w:pStyle w:val="BodyText"/>
+      </w:pPr>
       <w:r>
-        <w:t xml:space="preserve">Lesson 5: Why Early Awareness Protects the Future</w:t>
+        <w:t xml:space="preserve">LESSON 5: Why Early Awareness Protects the Future</w:t>
       </w:r>
     </w:p>
     <w:sectPr>
@@ -73,40 +91,101 @@
 </file>
 
 <file path=word/styles.xml><?xml version="1.0" encoding="utf-8"?>
-<w:styles xmlns:w="http://schemas.openxmlformats.org/wordprocessingml/2006/main">
-  <w:style w:type="paragraph" w:default="1" w:styleId="Normal">
+<w:styles xmlns:r="http://schemas.openxmlformats.org/officeDocument/2006/relationships" xmlns:w="http://schemas.openxmlformats.org/wordprocessingml/2006/main">
+  <w:docDefaults>
+    <w:rPrDefault>
+      <w:rPr>
+        <w:rFonts w:asciiTheme="minorHAnsi" w:cstheme="minorBidi" w:eastAsiaTheme="minorHAnsi" w:hAnsiTheme="minorHAnsi"/>
+        <w:sz w:val="24"/>
+        <w:szCs w:val="24"/>
+        <w:lang w:bidi="ar-SA" w:eastAsia="en-US" w:val="en-US"/>
+      </w:rPr>
+    </w:rPrDefault>
+    <w:pPrDefault>
+      <w:pPr>
+        <w:spacing w:after="200"/>
+      </w:pPr>
+    </w:pPrDefault>
+  </w:docDefaults>
+  <w:latentStyles w:count="276" w:defLockedState="0" w:defQFormat="0" w:defSemiHidden="0" w:defUIPriority="0" w:defUnhideWhenUsed="0"/>
+  <w:style w:default="1" w:styleId="Normal" w:type="paragraph">
     <w:name w:val="Normal"/>
     <w:qFormat/>
+  </w:style>
+  <w:style w:styleId="BodyText" w:type="paragraph">
+    <w:name w:val="Body Text"/>
+    <w:basedOn w:val="Normal"/>
+    <w:qFormat/>
+    <w:pPr>
+      <w:spacing w:after="180" w:before="180"/>
+    </w:pPr>
+  </w:style>
+  <w:style w:customStyle="1" w:styleId="FirstParagraph" w:type="paragraph">
+    <w:name w:val="First Paragraph"/>
+    <w:basedOn w:val="BodyText"/>
+    <w:next w:val="BodyText"/>
+    <w:qFormat/>
+  </w:style>
+  <w:style w:customStyle="1" w:styleId="Compact" w:type="paragraph">
+    <w:name w:val="Compact"/>
+    <w:basedOn w:val="BodyText"/>
+    <w:qFormat/>
+    <w:pPr>
+      <w:spacing w:after="36" w:before="36"/>
+    </w:pPr>
+  </w:style>
+  <w:style w:styleId="Heading1" w:type="paragraph">
+    <w:name w:val="heading 1"/>
+    <w:basedOn w:val="Normal"/>
+    <w:next w:val="BodyText"/>
+    <w:qFormat/>
+    <w:pPr>
+      <w:keepNext/>
+      <w:keepLines/>
+      <w:spacing w:after="80" w:before="360"/>
+      <w:outlineLvl w:val="0"/>
+    </w:pPr>
     <w:rPr>
-      <w:rFonts w:ascii="Arial" w:hAnsi="Arial"/>
-      <w:sz w:val="22"/>
+      <w:rFonts w:asciiTheme="majorHAnsi" w:cstheme="majorBidi" w:eastAsiaTheme="majorEastAsia" w:hAnsiTheme="majorHAnsi"/>
+      <w:color w:themeColor="accent1" w:themeShade="BF" w:val="0F4761"/>
+      <w:sz w:val="40"/>
+      <w:szCs w:val="40"/>
     </w:rPr>
   </w:style>
-  <w:style w:type="paragraph" w:styleId="Title">
-    <w:name w:val="Title"/>
+  <w:style w:styleId="Heading2" w:type="paragraph">
+    <w:name w:val="heading 2"/>
     <w:basedOn w:val="Normal"/>
+    <w:next w:val="BodyText"/>
     <w:qFormat/>
+    <w:pPr>
+      <w:keepNext/>
+      <w:keepLines/>
+      <w:spacing w:after="80" w:before="160"/>
+      <w:outlineLvl w:val="1"/>
+    </w:pPr>
     <w:rPr>
-      <w:b/>
+      <w:rFonts w:asciiTheme="majorHAnsi" w:cstheme="majorBidi" w:eastAsiaTheme="majorEastAsia" w:hAnsiTheme="majorHAnsi"/>
+      <w:color w:themeColor="accent1" w:themeShade="BF" w:val="0F4761"/>
       <w:sz w:val="32"/>
+      <w:szCs w:val="32"/>
     </w:rPr>
   </w:style>
-  <w:style w:type="paragraph" w:styleId="Heading1">
-    <w:name w:val="heading 1"/>
+  <w:style w:styleId="Heading3" w:type="paragraph">
+    <w:name w:val="heading 3"/>
     <w:basedOn w:val="Normal"/>
+    <w:next w:val="BodyText"/>
     <w:qFormat/>
+    <w:pPr>
+      <w:keepNext/>
+      <w:keepLines/>
+      <w:spacing w:after="80" w:before="160"/>
+      <w:outlineLvl w:val="2"/>
+    </w:pPr>
     <w:rPr>
-      <w:b/>
+      <w:rFonts w:cstheme="majorBidi" w:eastAsiaTheme="majorEastAsia"/>
+      <w:color w:themeColor="accent1" w:themeShade="BF" w:val="0F4761"/>
       <w:sz w:val="28"/>
-    </w:rPr>
-  </w:style>
-  <w:style w:type="paragraph" w:styleId="Heading2">
-    <w:name w:val="heading 2"/>
-    <w:basedOn w:val="Normal"/>
-    <w:qFormat/>
-    <w:rPr>
-      <w:b/>
-      <w:sz w:val="24"/>
+      <w:szCs w:val="28"/>
     </w:rPr>
   </w:style>
 </w:styles>

</xml_diff>